<commit_message>
[docs] Update the Keycloak document after the container check
Co-Authored-By: Claude Sonnet 5.5 <noreply@anthropic.com>
</commit_message>
<xml_diff>
--- a/doc/MLW_Integration.docx
+++ b/doc/MLW_Integration.docx
@@ -1978,7 +1978,7 @@
         <w:pStyle w:val="ListBullet"/>
       </w:pPr>
       <w:r>
-        <w:t xml:space="preserve">Checked by hand against a real Keycloak (realm </w:t>
+        <w:t xml:space="preserve">Checked against a real Keycloak (realm </w:t>
       </w:r>
       <w:r>
         <w:rPr>
@@ -2008,7 +2008,7 @@
         <w:t>msm</w:t>
       </w:r>
       <w:r>
-        <w:t>) with Zou run from a Python environment on the host: login by email 200, login by username 200, wrong password 400, person created as Mark Millard with role user.</w:t>
+        <w:t>), both with Zou run from a Python environment on the host and with Zou in the Docker image of mlw-zou-docker: login by email 200, login by username 200, wrong password 400, person created as Mark Millard with role user.</w:t>
       </w:r>
     </w:p>
     <w:p>
@@ -2016,7 +2016,7 @@
         <w:pStyle w:val="ListBullet"/>
       </w:pPr>
       <w:r>
-        <w:t>Not yet checked: Zou running inside the Docker image against Keycloak, and a login from the Kitsu page in a browser.</w:t>
+        <w:t>Not yet checked: a login from the Kitsu page in a browser.</w:t>
       </w:r>
     </w:p>
     <w:sectPr>

</xml_diff>

<commit_message>
[auth] Add KEYCLOAK_SYNC_ROLE to set the role at first login only
With KEYCLOAK_SYNC_ROLE=first-login the role mapped from Keycloak is set
when the person is created and left alone at later logins, so changes
made in Kitsu stick. The default, always, keeps the role in step with
Keycloak at every login.

Tests: test_first_login_sync_keeps_the_role_set_in_kitsu.

Co-Authored-By: Claude Sonnet 5.5 <noreply@anthropic.com>
</commit_message>
<xml_diff>
--- a/doc/MLW_Integration.docx
+++ b/doc/MLW_Integration.docx
@@ -530,7 +530,52 @@
     <w:p/>
     <w:p>
       <w:r>
-        <w:t>A mapped value that is not one of the six Kitsu roles is ignored. The role is rewritten at every login, so a role changed in Keycloak applies at the user's next login, and a role changed by hand in Kitsu is overwritten.</w:t>
+        <w:t xml:space="preserve">A mapped value that is not one of the six Kitsu roles is ignored. The role is rewritten at every login, so a role changed in Keycloak applies at the user's next login, and a role changed by hand in Kitsu is overwritten. This is </w:t>
+      </w:r>
+      <w:r>
+        <w:rPr>
+          <w:rFonts w:ascii="Consolas" w:hAnsi="Consolas"/>
+          <w:sz w:val="20"/>
+        </w:rPr>
+        <w:t>KEYCLOAK_SYNC_ROLE=always</w:t>
+      </w:r>
+      <w:r>
+        <w:t>, the default.</w:t>
+      </w:r>
+    </w:p>
+    <w:p>
+      <w:r>
+        <w:t xml:space="preserve">With </w:t>
+      </w:r>
+      <w:r>
+        <w:rPr>
+          <w:rFonts w:ascii="Consolas" w:hAnsi="Consolas"/>
+          <w:sz w:val="20"/>
+        </w:rPr>
+        <w:t>KEYCLOAK_SYNC_ROLE=first-login</w:t>
+      </w:r>
+      <w:r>
+        <w:t xml:space="preserve"> the mapped role is set only when the person is created. At later logins the role is left alone, so changes made in Kitsu stick, while the first and last name still follow Keycloak. Use it to avoid locking out an administrator whose Keycloak roles do not map to admin. Any value other than </w:t>
+      </w:r>
+      <w:r>
+        <w:rPr>
+          <w:rFonts w:ascii="Consolas" w:hAnsi="Consolas"/>
+          <w:sz w:val="20"/>
+        </w:rPr>
+        <w:t>first-login</w:t>
+      </w:r>
+      <w:r>
+        <w:t xml:space="preserve"> behaves as </w:t>
+      </w:r>
+      <w:r>
+        <w:rPr>
+          <w:rFonts w:ascii="Consolas" w:hAnsi="Consolas"/>
+          <w:sz w:val="20"/>
+        </w:rPr>
+        <w:t>always</w:t>
+      </w:r>
+      <w:r>
+        <w:t>.</w:t>
       </w:r>
     </w:p>
     <w:p>
@@ -948,6 +993,71 @@
             <w:r/>
             <w:r>
               <w:t>Role of a user with no mapped Keycloak role.</w:t>
+            </w:r>
+          </w:p>
+        </w:tc>
+      </w:tr>
+      <w:tr>
+        <w:tc>
+          <w:tcPr>
+            <w:tcW w:type="dxa" w:w="2736"/>
+          </w:tcPr>
+          <w:p>
+            <w:r/>
+            <w:r/>
+            <w:r>
+              <w:rPr>
+                <w:rFonts w:ascii="Consolas" w:hAnsi="Consolas"/>
+                <w:sz w:val="20"/>
+              </w:rPr>
+              <w:t>KEYCLOAK_SYNC_ROLE</w:t>
+            </w:r>
+            <w:r/>
+          </w:p>
+        </w:tc>
+        <w:tc>
+          <w:tcPr>
+            <w:tcW w:type="dxa" w:w="3168"/>
+          </w:tcPr>
+          <w:p>
+            <w:r/>
+            <w:r/>
+            <w:r>
+              <w:rPr>
+                <w:rFonts w:ascii="Consolas" w:hAnsi="Consolas"/>
+                <w:sz w:val="20"/>
+              </w:rPr>
+              <w:t>always</w:t>
+            </w:r>
+            <w:r/>
+          </w:p>
+        </w:tc>
+        <w:tc>
+          <w:tcPr>
+            <w:tcW w:type="dxa" w:w="3456"/>
+          </w:tcPr>
+          <w:p>
+            <w:r/>
+            <w:r/>
+            <w:r>
+              <w:rPr>
+                <w:rFonts w:ascii="Consolas" w:hAnsi="Consolas"/>
+                <w:sz w:val="20"/>
+              </w:rPr>
+              <w:t>always</w:t>
+            </w:r>
+            <w:r>
+              <w:t xml:space="preserve">: the role follows Keycloak at every login. </w:t>
+            </w:r>
+            <w:r>
+              <w:rPr>
+                <w:rFonts w:ascii="Consolas" w:hAnsi="Consolas"/>
+                <w:sz w:val="20"/>
+              </w:rPr>
+              <w:t>first-login</w:t>
+            </w:r>
+            <w:r>
+              <w:t>: set only when the person is created.</w:t>
             </w:r>
           </w:p>
         </w:tc>
@@ -1970,7 +2080,7 @@
         <w:pStyle w:val="ListBullet"/>
       </w:pPr>
       <w:r>
-        <w:t>Unit and service tests pass (227 in the auth-related test files).</w:t>
+        <w:t>Unit and service tests pass (228 in the auth-related test files).</w:t>
       </w:r>
     </w:p>
     <w:p>

</xml_diff>